<commit_message>
final items for resubmit
</commit_message>
<xml_diff>
--- a/docs/manuscript/reviewer_comments_EE.docx
+++ b/docs/manuscript/reviewer_comments_EE.docx
@@ -1,6 +1,6 @@
 
 <file path=word/document.xml><?xml version="1.0" encoding="utf-8"?>
-<w:document xmlns:wpc="http://schemas.microsoft.com/office/word/2010/wordprocessingCanvas" xmlns:cx="http://schemas.microsoft.com/office/drawing/2014/chartex" xmlns:cx1="http://schemas.microsoft.com/office/drawing/2015/9/8/chartex" xmlns:cx2="http://schemas.microsoft.com/office/drawing/2015/10/21/chartex" xmlns:cx3="http://schemas.microsoft.com/office/drawing/2016/5/9/chartex" xmlns:cx4="http://schemas.microsoft.com/office/drawing/2016/5/10/chartex" xmlns:cx5="http://schemas.microsoft.com/office/drawing/2016/5/11/chartex" xmlns:cx6="http://schemas.microsoft.com/office/drawing/2016/5/12/chartex" xmlns:cx7="http://schemas.microsoft.com/office/drawing/2016/5/13/chartex" xmlns:cx8="http://schemas.microsoft.com/office/drawing/2016/5/14/chartex" xmlns:mc="http://schemas.openxmlformats.org/markup-compatibility/2006" xmlns:aink="http://schemas.microsoft.com/office/drawing/2016/ink" xmlns:am3d="http://schemas.microsoft.com/office/drawing/2017/model3d" xmlns:o="urn:schemas-microsoft-com:office:office" xmlns:oel="http://schemas.microsoft.com/office/2019/extlst" xmlns:r="http://schemas.openxmlformats.org/officeDocument/2006/relationships" xmlns:m="http://schemas.openxmlformats.org/officeDocument/2006/math" xmlns:v="urn:schemas-microsoft-com:vml" xmlns:wp14="http://schemas.microsoft.com/office/word/2010/wordprocessingDrawing" xmlns:wp="http://schemas.openxmlformats.org/drawingml/2006/wordprocessingDrawing" xmlns:w10="urn:schemas-microsoft-com:office:word" xmlns:w="http://schemas.openxmlformats.org/wordprocessingml/2006/main" xmlns:w14="http://schemas.microsoft.com/office/word/2010/wordml" xmlns:w15="http://schemas.microsoft.com/office/word/2012/wordml" xmlns:w16cex="http://schemas.microsoft.com/office/word/2018/wordml/cex" xmlns:w16cid="http://schemas.microsoft.com/office/word/2016/wordml/cid" xmlns:w16="http://schemas.microsoft.com/office/word/2018/wordml" xmlns:w16du="http://schemas.microsoft.com/office/word/2023/wordml/word16du" xmlns:w16sdtdh="http://schemas.microsoft.com/office/word/2020/wordml/sdtdatahash" xmlns:w16sdtfl="http://schemas.microsoft.com/office/word/2024/wordml/sdtformatlock" xmlns:w16se="http://schemas.microsoft.com/office/word/2015/wordml/symex" xmlns:wpg="http://schemas.microsoft.com/office/word/2010/wordprocessingGroup" xmlns:wpi="http://schemas.microsoft.com/office/word/2010/wordprocessingInk" xmlns:wne="http://schemas.microsoft.com/office/word/2006/wordml" xmlns:wps="http://schemas.microsoft.com/office/word/2010/wordprocessingShape" mc:Ignorable="w14 w15 w16se w16cid w16 w16cex w16sdtdh w16sdtfl w16du wp14">
+<w:document xmlns:wpc="http://schemas.microsoft.com/office/word/2010/wordprocessingCanvas" xmlns:cx="http://schemas.microsoft.com/office/drawing/2014/chartex" xmlns:cx1="http://schemas.microsoft.com/office/drawing/2015/9/8/chartex" xmlns:cx2="http://schemas.microsoft.com/office/drawing/2015/10/21/chartex" xmlns:cx3="http://schemas.microsoft.com/office/drawing/2016/5/9/chartex" xmlns:cx4="http://schemas.microsoft.com/office/drawing/2016/5/10/chartex" xmlns:cx5="http://schemas.microsoft.com/office/drawing/2016/5/11/chartex" xmlns:cx6="http://schemas.microsoft.com/office/drawing/2016/5/12/chartex" xmlns:cx7="http://schemas.microsoft.com/office/drawing/2016/5/13/chartex" xmlns:cx8="http://schemas.microsoft.com/office/drawing/2016/5/14/chartex" xmlns:mc="http://schemas.openxmlformats.org/markup-compatibility/2006" xmlns:m="http://schemas.openxmlformats.org/officeDocument/2006/math" xmlns:aink="http://schemas.microsoft.com/office/drawing/2016/ink" xmlns:am3d="http://schemas.microsoft.com/office/drawing/2017/model3d" xmlns:oel="http://schemas.microsoft.com/office/2019/extlst" xmlns:r="http://schemas.openxmlformats.org/officeDocument/2006/relationships" xmlns:wp14="http://schemas.microsoft.com/office/word/2010/wordprocessingDrawing" xmlns:wp="http://schemas.openxmlformats.org/drawingml/2006/wordprocessingDrawing" xmlns:wpg="http://schemas.microsoft.com/office/word/2010/wordprocessingGroup" xmlns:wpi="http://schemas.microsoft.com/office/word/2010/wordprocessingInk" xmlns:wps="http://schemas.microsoft.com/office/word/2010/wordprocessingShape" xmlns:o="urn:schemas-microsoft-com:office:office" xmlns:v="urn:schemas-microsoft-com:vml" xmlns:w10="urn:schemas-microsoft-com:office:word" xmlns:w="http://schemas.openxmlformats.org/wordprocessingml/2006/main" xmlns:w14="http://schemas.microsoft.com/office/word/2010/wordml" xmlns:w15="http://schemas.microsoft.com/office/word/2012/wordml" xmlns:w16cex="http://schemas.microsoft.com/office/word/2018/wordml/cex" xmlns:w16cid="http://schemas.microsoft.com/office/word/2016/wordml/cid" xmlns:w16="http://schemas.microsoft.com/office/word/2018/wordml" xmlns:w16sdtdh="http://schemas.microsoft.com/office/word/2020/wordml/sdtdatahash" xmlns:w16sdtfl="http://schemas.microsoft.com/office/word/2024/wordml/sdtformatlock" xmlns:w16se="http://schemas.microsoft.com/office/word/2015/wordml/symex" xmlns:w16du="http://schemas.microsoft.com/office/word/2023/wordml/word16du" xmlns:wne="http://schemas.microsoft.com/office/word/2006/wordml" mc:Ignorable="w14 w15 w16se w16cid w16 w16cex w16sdtdh w16sdtfl w16du wp14">
   <w:body>
     <w:p>
       <w:pPr>
@@ -30,17 +30,15 @@
         </w:rPr>
         <w:t xml:space="preserve">We thank the reviewer and associate editor for their comments on the </w:t>
       </w:r>
-      <w:proofErr w:type="spellStart"/>
-      <w:r>
-        <w:rPr>
-          <w:rFonts w:ascii="Aptos" w:hAnsi="Aptos"/>
-          <w:color w:val="4C94D8" w:themeColor="text2" w:themeTint="80"/>
-          <w:sz w:val="22"/>
-          <w:szCs w:val="22"/>
-        </w:rPr>
-        <w:t>mansuscript</w:t>
-      </w:r>
-      <w:proofErr w:type="spellEnd"/>
+      <w:r>
+        <w:rPr>
+          <w:rFonts w:ascii="Aptos" w:hAnsi="Aptos"/>
+          <w:color w:val="4C94D8" w:themeColor="text2" w:themeTint="80"/>
+          <w:sz w:val="22"/>
+          <w:szCs w:val="22"/>
+        </w:rPr>
+        <w:t>manuscript</w:t>
+      </w:r>
       <w:r>
         <w:rPr>
           <w:rFonts w:ascii="Aptos" w:hAnsi="Aptos"/>
@@ -253,16 +251,7 @@
           <w:sz w:val="22"/>
           <w:szCs w:val="22"/>
         </w:rPr>
-        <w:t>Sorry, we were not more clear in our statement. It has been changed to, “</w:t>
-      </w:r>
-      <w:r>
-        <w:rPr>
-          <w:rFonts w:ascii="Aptos" w:hAnsi="Aptos"/>
-          <w:color w:val="4C94D8" w:themeColor="text2" w:themeTint="80"/>
-          <w:sz w:val="22"/>
-          <w:szCs w:val="22"/>
-        </w:rPr>
-        <w:t xml:space="preserve">The repository will become publicly archived as a release to </w:t>
+        <w:t xml:space="preserve">Sorry, we were not more clear in our statement. It has been changed to, “The repository will become publicly archived as a release to </w:t>
       </w:r>
       <w:proofErr w:type="spellStart"/>
       <w:r>
@@ -282,16 +271,7 @@
           <w:sz w:val="22"/>
           <w:szCs w:val="22"/>
         </w:rPr>
-        <w:t xml:space="preserve"> with a DOI at acceptance of the manuscript.</w:t>
-      </w:r>
-      <w:r>
-        <w:rPr>
-          <w:rFonts w:ascii="Aptos" w:hAnsi="Aptos"/>
-          <w:color w:val="4C94D8" w:themeColor="text2" w:themeTint="80"/>
-          <w:sz w:val="22"/>
-          <w:szCs w:val="22"/>
-        </w:rPr>
-        <w:t>”</w:t>
+        <w:t xml:space="preserve"> with a DOI at acceptance of the manuscript.”</w:t>
       </w:r>
       <w:r>
         <w:rPr>
@@ -714,16 +694,7 @@
           <w:sz w:val="22"/>
           <w:szCs w:val="22"/>
         </w:rPr>
-        <w:t>“</w:t>
-      </w:r>
-      <w:r>
-        <w:rPr>
-          <w:rFonts w:ascii="Aptos" w:hAnsi="Aptos"/>
-          <w:color w:val="4C94D8" w:themeColor="text2" w:themeTint="80"/>
-          <w:sz w:val="22"/>
-          <w:szCs w:val="22"/>
-        </w:rPr>
-        <w:t>This modeling framework is largely designed to work within organisms’ range of thermal optima. Specifically, the approach presented here ignores Jensen’s inequality (Ruel et al. 1999), as models are parameterized with temperatures generally within thresholds suitable for their respective organisms. Organisms experiencing temperatures outside of those thresholds may respond in a manner that doesn’t match the modeled relationship or adds additional error to the model (</w:t>
+        <w:t>“This modeling framework is largely designed to work within organisms’ range of thermal optima. Specifically, the approach presented here ignores Jensen’s inequality (Ruel et al. 1999), as models are parameterized with temperatures generally within thresholds suitable for their respective organisms. Organisms experiencing temperatures outside of those thresholds may respond in a manner that doesn’t match the modeled relationship or adds additional error to the model (</w:t>
       </w:r>
       <w:proofErr w:type="spellStart"/>
       <w:r>
@@ -892,16 +863,7 @@
           <w:sz w:val="22"/>
           <w:szCs w:val="22"/>
         </w:rPr>
-        <w:t xml:space="preserve"> et al. 2022). As with any model of developmental timing, </w:t>
-      </w:r>
-      <w:r>
-        <w:rPr>
-          <w:rFonts w:ascii="Aptos" w:hAnsi="Aptos"/>
-          <w:color w:val="4C94D8" w:themeColor="text2" w:themeTint="80"/>
-          <w:sz w:val="22"/>
-          <w:szCs w:val="22"/>
-        </w:rPr>
-        <w:t>…”</w:t>
+        <w:t xml:space="preserve"> et al. 2022). As with any model of developmental timing, …”</w:t>
       </w:r>
       <w:r>
         <w:rPr>
@@ -1080,25 +1042,7 @@
           <w:sz w:val="22"/>
           <w:szCs w:val="22"/>
         </w:rPr>
-        <w:t xml:space="preserve"> situ thermal regimes, we used data from Sparks et al. (2017). Briefly, in this study they reared populations of sockeye salmon from highly divergent thermal environments in a common garden </w:t>
-      </w:r>
-      <w:r>
-        <w:rPr>
-          <w:rFonts w:ascii="Aptos" w:hAnsi="Aptos"/>
-          <w:color w:val="4C94D8" w:themeColor="text2" w:themeTint="80"/>
-          <w:sz w:val="22"/>
-          <w:szCs w:val="22"/>
-        </w:rPr>
-        <w:t>experimental</w:t>
-      </w:r>
-      <w:r>
-        <w:rPr>
-          <w:rFonts w:ascii="Aptos" w:hAnsi="Aptos"/>
-          <w:color w:val="4C94D8" w:themeColor="text2" w:themeTint="80"/>
-          <w:sz w:val="22"/>
-          <w:szCs w:val="22"/>
-        </w:rPr>
-        <w:t xml:space="preserve"> design. Fertilized embryos were transported from their natal environments the day of fertilization and reared in experimental thermal regimes that were chosen to reflect empirical regimes measured in their home locations (Woody Island and Pedro Ponds). The regimes represent a highly thermally variable and warmer, wind-mixed island shore habitat (Woody Island) and cool and stable spring-fed ponds (Pedro Ponds). The exact details of the treatments are available in Sparks et al. (2017), but the treatments were designed to either match</w:t>
+        <w:t xml:space="preserve"> situ thermal regimes, we used data from Sparks et al. (2017). Briefly, in this study they reared populations of sockeye salmon from highly divergent thermal environments in a common garden experimental design. Fertilized embryos were transported from their natal environments the day of fertilization and reared in experimental thermal regimes that were chosen to reflect empirical regimes measured in their home locations (Woody Island and Pedro Ponds). The regimes represent a highly thermally variable and warmer, wind-mixed island shore habitat (Woody Island) and cool and stable spring-fed ponds (Pedro Ponds). The exact details of the treatments are available in Sparks et al. (2017), but the treatments were designed to either match</w:t>
       </w:r>
       <w:r>
         <w:rPr>
@@ -1216,16 +1160,7 @@
           <w:sz w:val="22"/>
           <w:szCs w:val="22"/>
         </w:rPr>
-        <w:t>, the most variable of the scenarios (mean = 5.418, SD = 3.136), and predicted a mean hatch date 8 days later (6.8%) than observed.</w:t>
-      </w:r>
-      <w:r>
-        <w:rPr>
-          <w:rFonts w:ascii="Aptos" w:hAnsi="Aptos"/>
-          <w:color w:val="4C94D8" w:themeColor="text2" w:themeTint="80"/>
-          <w:sz w:val="22"/>
-          <w:szCs w:val="22"/>
-        </w:rPr>
-        <w:t>”</w:t>
+        <w:t>, the most variable of the scenarios (mean = 5.418, SD = 3.136), and predicted a mean hatch date 8 days later (6.8%) than observed.”</w:t>
       </w:r>
     </w:p>
     <w:p>
@@ -1385,25 +1320,7 @@
           <w:sz w:val="22"/>
           <w:szCs w:val="22"/>
         </w:rPr>
-        <w:t xml:space="preserve"> they are formatted to meet general BES guidelines, “</w:t>
-      </w:r>
-      <w:r>
-        <w:rPr>
-          <w:rFonts w:ascii="Aptos" w:hAnsi="Aptos"/>
-          <w:color w:val="4C94D8" w:themeColor="text2" w:themeTint="80"/>
-          <w:sz w:val="22"/>
-          <w:szCs w:val="22"/>
-        </w:rPr>
-        <w:t>Legends should provide enough details for the figure or table to be understood without reference to the main text.</w:t>
-      </w:r>
-      <w:r>
-        <w:rPr>
-          <w:rFonts w:ascii="Aptos" w:hAnsi="Aptos"/>
-          <w:color w:val="4C94D8" w:themeColor="text2" w:themeTint="80"/>
-          <w:sz w:val="22"/>
-          <w:szCs w:val="22"/>
-        </w:rPr>
-        <w:t>”</w:t>
+        <w:t xml:space="preserve"> they are formatted to meet general BES guidelines, “Legends should provide enough details for the figure or table to be understood without reference to the main text.”</w:t>
       </w:r>
       <w:r>
         <w:rPr>
@@ -1535,7 +1452,7 @@
 </file>
 
 <file path=word/styles.xml><?xml version="1.0" encoding="utf-8"?>
-<w:styles xmlns:mc="http://schemas.openxmlformats.org/markup-compatibility/2006" xmlns:r="http://schemas.openxmlformats.org/officeDocument/2006/relationships" xmlns:w="http://schemas.openxmlformats.org/wordprocessingml/2006/main" xmlns:w14="http://schemas.microsoft.com/office/word/2010/wordml" xmlns:w15="http://schemas.microsoft.com/office/word/2012/wordml" xmlns:w16cex="http://schemas.microsoft.com/office/word/2018/wordml/cex" xmlns:w16cid="http://schemas.microsoft.com/office/word/2016/wordml/cid" xmlns:w16="http://schemas.microsoft.com/office/word/2018/wordml" xmlns:w16du="http://schemas.microsoft.com/office/word/2023/wordml/word16du" xmlns:w16sdtdh="http://schemas.microsoft.com/office/word/2020/wordml/sdtdatahash" xmlns:w16sdtfl="http://schemas.microsoft.com/office/word/2024/wordml/sdtformatlock" xmlns:w16se="http://schemas.microsoft.com/office/word/2015/wordml/symex" mc:Ignorable="w14 w15 w16se w16cid w16 w16cex w16sdtdh w16sdtfl w16du">
+<w:styles xmlns:mc="http://schemas.openxmlformats.org/markup-compatibility/2006" xmlns:r="http://schemas.openxmlformats.org/officeDocument/2006/relationships" xmlns:w="http://schemas.openxmlformats.org/wordprocessingml/2006/main" xmlns:w14="http://schemas.microsoft.com/office/word/2010/wordml" xmlns:w15="http://schemas.microsoft.com/office/word/2012/wordml" xmlns:w16cex="http://schemas.microsoft.com/office/word/2018/wordml/cex" xmlns:w16cid="http://schemas.microsoft.com/office/word/2016/wordml/cid" xmlns:w16="http://schemas.microsoft.com/office/word/2018/wordml" xmlns:w16sdtdh="http://schemas.microsoft.com/office/word/2020/wordml/sdtdatahash" xmlns:w16sdtfl="http://schemas.microsoft.com/office/word/2024/wordml/sdtformatlock" xmlns:w16se="http://schemas.microsoft.com/office/word/2015/wordml/symex" xmlns:w16du="http://schemas.microsoft.com/office/word/2023/wordml/word16du" mc:Ignorable="w14 w15 w16se w16cid w16 w16cex w16sdtdh w16sdtfl w16du">
   <w:docDefaults>
     <w:rPrDefault>
       <w:rPr>

</xml_diff>